<commit_message>
Finish paper 2 on the full drug corpus
The pharmaceutical corpus doubled once the fetcher stopped discarding its
work on a transient portal error: 3,052 records, 1,682 of them carrying both
the approval register and the patient leaflet. Twelve thousand four hundred
and fourteen records across the three domains.

The numbers moved a little and every one of them is regenerated rather than
edited by hand — validation, both figures, both drafts, the cover letter and
the submission package. Expansion ratio for drugs 1.64 to 1.63, exact match
44.0% to 45.0%. Stability is unchanged at 100 / 100 / 99.8.

Adds the dataset export's real run: one JSONL per domain plus a manifest,
9.5 million braille cells in total.
</commit_message>
<xml_diff>
--- a/paper2/submission/manuscript.docx
+++ b/paper2/submission/manuscript.docx
@@ -77,7 +77,7 @@
         <w:t>Results.</w:t>
       </w:r>
       <w:r>
-        <w:t xml:space="preserve"> 10,887 records were collected and encoded across the three registers. Median record length spans more than two orders of magnitude, from 154 to 539 characters, while cells per source character stay between 1.64 and 1.78. Rule violations were zero in all three domains. Exact match diverged sharply — 9.5% for pesticides, 44.0% for drugs, 43.6% for incidents — while stability was 100%, 100%, and 99.8%. That gap is itself the result: what exact match counts as failure is transformation the rules require, chiefly the space 제38항 [다만] mandates between a digit and an initial that shares its cell, which appears in almost every pesticide row. </w:t>
+        <w:t xml:space="preserve"> 12,414 records were collected and encoded across the three registers. Median record length spans more than two orders of magnitude, from 154 to 540 characters, while cells per source character stay between 1.63 and 1.78. Rule violations were zero in all three domains. Exact match diverged sharply — 9.5% for pesticides, 45.0% for drugs, 43.6% for incidents — while stability was 100%, 100%, and 99.8%. That gap is itself the result: what exact match counts as failure is transformation the rules require, chiefly the space 제38항 [다만] mandates between a digit and an initial that shares its cell, which appears in almost every pesticide row. </w:t>
       </w:r>
       <w:r>
         <w:rPr>
@@ -177,7 +177,7 @@
         <w:pStyle w:val="ListNumber"/>
       </w:pPr>
       <w:r>
-        <w:t>A braille dataset of 10,887 records across three public-safety registers</w:t>
+        <w:t>A braille dataset of 12,414 records across three public-safety registers</w:t>
       </w:r>
     </w:p>
     <w:p>
@@ -624,7 +624,7 @@
           <w:p>
             <w:r/>
             <w:r>
-              <w:t>1,525</w:t>
+              <w:t>3,052</w:t>
             </w:r>
           </w:p>
         </w:tc>
@@ -1389,7 +1389,7 @@
           <w:p>
             <w:r/>
             <w:r>
-              <w:t>1,525</w:t>
+              <w:t>3,052</w:t>
             </w:r>
           </w:p>
         </w:tc>
@@ -1400,7 +1400,7 @@
           <w:p>
             <w:r/>
             <w:r>
-              <w:t>532,120</w:t>
+              <w:t>499,637</w:t>
             </w:r>
           </w:p>
         </w:tc>
@@ -1411,7 +1411,7 @@
           <w:p>
             <w:r/>
             <w:r>
-              <w:t>874,549</w:t>
+              <w:t>813,794</w:t>
             </w:r>
           </w:p>
         </w:tc>
@@ -1422,7 +1422,7 @@
           <w:p>
             <w:r/>
             <w:r>
-              <w:t>1.64</w:t>
+              <w:t>1.63</w:t>
             </w:r>
           </w:p>
         </w:tc>
@@ -1433,7 +1433,7 @@
           <w:p>
             <w:r/>
             <w:r>
-              <w:t>539 chars</w:t>
+              <w:t>540 chars</w:t>
             </w:r>
           </w:p>
         </w:tc>
@@ -1591,12 +1591,12 @@
     </w:p>
     <w:p>
       <w:r>
-        <w:t>Figure 3 carries both the paper's premise and its result. Median record length runs from 154 to 539 characters, and the distributions span more than two orders of magnitude. The pesticide distribution is narrow and sharp: one approved use has fixed fields, so its length barely varies. The incident distribution is the widest, because some cases are a single sentence and some are a full report with a numbered preamble.</w:t>
+        <w:t>Figure 3 carries both the paper's premise and its result. Median record length runs from 154 to 540 characters, and the distributions span more than two orders of magnitude. The pesticide distribution is narrow and sharp: one approved use has fixed fields, so its length barely varies. The incident distribution is the widest, because some cases are a single sentence and some are a full report with a numbered preamble.</w:t>
       </w:r>
     </w:p>
     <w:p>
       <w:r>
-        <w:t xml:space="preserve">Cells per source character, meanwhile, stay between 1.64 and 1.78. </w:t>
+        <w:t xml:space="preserve">Cells per source character, meanwhile, stay between 1.63 and 1.78. </w:t>
       </w:r>
       <w:r>
         <w:rPr>
@@ -1761,7 +1761,7 @@
           <w:p>
             <w:r/>
             <w:r>
-              <w:t>44.0%</w:t>
+              <w:t>45.0%</w:t>
             </w:r>
           </w:p>
         </w:tc>
@@ -1772,7 +1772,7 @@
           <w:p>
             <w:r/>
             <w:r>
-              <w:t>44.0%</w:t>
+              <w:t>45.0%</w:t>
             </w:r>
           </w:p>
         </w:tc>
@@ -2202,6 +2202,45 @@
     </w:p>
     <w:p>
       <w:r>
+        <w:t xml:space="preserve">The repair was checked for regressions separately. Across 1,267 cases — every regression case the repository holds plus a sample from all three domains — the change </w:t>
+      </w:r>
+      <w:r>
+        <w:rPr>
+          <w:b/>
+        </w:rPr>
+        <w:t>fixed one and broke none</w:t>
+      </w:r>
+      <w:r>
+        <w:t xml:space="preserve">, with four outputs differing and all four improved. One of those four is in the drug domain: </w:t>
+      </w:r>
+      <w:r>
+        <w:rPr>
+          <w:rFonts w:ascii="Consolas" w:hAnsi="Consolas"/>
+          <w:sz w:val="19"/>
+        </w:rPr>
+        <w:t>만성C.j영 간염</w:t>
+      </w:r>
+      <w:r>
+        <w:t xml:space="preserve"> became </w:t>
+      </w:r>
+      <w:r>
+        <w:rPr>
+          <w:rFonts w:ascii="Consolas" w:hAnsi="Consolas"/>
+          <w:sz w:val="19"/>
+        </w:rPr>
+        <w:t>만성C형 간염</w:t>
+      </w:r>
+      <w:r>
+        <w:t>. The earlier work's own domain was checked too: round-trip edit similarity over 300 real safety-data-sheet passages is 0.9992.</w:t>
+      </w:r>
+    </w:p>
+    <w:p>
+      <w:r>
+        <w:t>That the drug domain carried the same defect without its 800-record sample revealing it is worth recording. Free prose merely makes the layout frequent; it does not make it absent from record data.</w:t>
+      </w:r>
+    </w:p>
+    <w:p>
+      <w:r>
         <w:rPr>
           <w:b/>
         </w:rPr>
@@ -2406,12 +2445,12 @@
     </w:p>
     <w:p>
       <w:r>
-        <w:t>10,887 records were collected from three national registers — pharmaceutical, pesticide, and industrial accident — and encoded under the 2017 revised Korean braille rules. The earlier work's encoder was not modified; each register received one adapter that fixes reading order. Rule violations were zero, and stability was 100%, 100%, and 99.8%.</w:t>
+        <w:t>12,414 records were collected from three national registers — pharmaceutical, pesticide, and industrial accident — and encoded under the 2017 revised Korean braille rules. The earlier work's encoder was not modified; each register received one adapter that fixes reading order. Rule violations were zero, and stability was 100%, 100%, and 99.8%.</w:t>
       </w:r>
     </w:p>
     <w:p>
       <w:r>
-        <w:t>Document length spans more than two orders of magnitude while cells per character stay between 1.64 and 1.78. The shapes differ; the cost of embossing them barely does.</w:t>
+        <w:t>Document length spans more than two orders of magnitude while cells per character stay between 1.63 and 1.78. The shapes differ; the cost of embossing them barely does.</w:t>
       </w:r>
     </w:p>
     <w:p>

</xml_diff>